<commit_message>
docs: adiciona Anexo A (DPAs e páginas de segurança dos provedores) ao relatório
Anexo com os endereços oficiais de DPA e Trust/Security de Supabase, Vercel,
Anthropic, Groq e Z-API, e o passo a passo para o compliance solicitar e
arquivar cada documento.

Co-Authored-By: Claude Sonnet 5 <noreply@anthropic.com>
Claude-Session: https://claude.ai/code/session_01WW9ZuJM2kRZbDgQRaDGC61
</commit_message>
<xml_diff>
--- a/matriculas-whatsapp/RELATORIO_TECNICO_LOG20.docx
+++ b/matriculas-whatsapp/RELATORIO_TECNICO_LOG20.docx
@@ -8685,6 +8685,504 @@
       <w:pPr/>
       <w:r>
         <w:t xml:space="preserve">Este documento é uma descrição técnica e operacional do sistema, produzida para apoiar a análise do time de Compliance e T.I. da Ambev. Não substitui uma auditoria independente certificada nem parecer jurídico de LGPD. As políticas dos provedores terceiros (Supabase, Vercel, Z-API, Anthropic, Groq) devem ser confirmadas diretamente nas fontes oficiais na data da análise.</w:t>
+      </w:r>
+    </w:p>
+    <w:p>
+      <w:pPr>
+        <w:pStyle w:val="Heading1"/>
+      </w:pPr>
+      <w:r>
+        <w:t xml:space="preserve">Anexo A — DPAs e Páginas de Segurança dos Provedores</w:t>
+      </w:r>
+    </w:p>
+    <w:p>
+      <w:pPr/>
+      <w:r>
+        <w:t xml:space="preserve">Para a análise de compliance, recomenda-se solicitar e arquivar os DPAs (Data Processing Agreements / Contratos de Tratamento de Dados) e as páginas de Trust &amp; Security de cada subprocessador. Endereços oficiais (confirmar na fonte, pois podem mudar):</w:t>
+      </w:r>
+    </w:p>
+    <w:tbl>
+      <w:tblPr>
+        <w:tblW w:w="9360" w:type="dxa"/>
+        <w:tblBorders>
+          <w:top w:val="single" w:sz="4" w:space="0" w:color="D0D5DD"/>
+          <w:left w:val="single" w:sz="4" w:space="0" w:color="D0D5DD"/>
+          <w:bottom w:val="single" w:sz="4" w:space="0" w:color="D0D5DD"/>
+          <w:right w:val="single" w:sz="4" w:space="0" w:color="D0D5DD"/>
+          <w:insideH w:val="single" w:sz="4" w:space="0" w:color="D0D5DD"/>
+          <w:insideV w:val="single" w:sz="4" w:space="0" w:color="D0D5DD"/>
+        </w:tblBorders>
+        <w:tblLayout w:type="fixed"/>
+      </w:tblPr>
+      <w:tblGrid>
+        <w:gridCol w:w="1800"/>
+        <w:gridCol w:w="3780"/>
+        <w:gridCol w:w="3780"/>
+      </w:tblGrid>
+      <w:tr>
+        <w:trPr>
+          <w:tblHeader/>
+        </w:trPr>
+        <w:tc>
+          <w:tcPr>
+            <w:tcW w:w="1800" w:type="dxa"/>
+            <w:shd w:val="clear" w:fill="16233F"/>
+            <w:tcMar>
+              <w:top w:w="60" w:type="dxa"/>
+              <w:left w:w="90" w:type="dxa"/>
+              <w:bottom w:w="60" w:type="dxa"/>
+              <w:right w:w="90" w:type="dxa"/>
+            </w:tcMar>
+          </w:tcPr>
+          <w:p>
+            <w:pPr>
+              <w:spacing w:after="0"/>
+            </w:pPr>
+            <w:r>
+              <w:rPr>
+                <w:b/>
+                <w:color w:val="FFFFFF"/>
+                <w:sz w:val="18"/>
+              </w:rPr>
+              <w:t xml:space="preserve">Provedor</w:t>
+            </w:r>
+          </w:p>
+        </w:tc>
+        <w:tc>
+          <w:tcPr>
+            <w:tcW w:w="3780" w:type="dxa"/>
+            <w:shd w:val="clear" w:fill="16233F"/>
+            <w:tcMar>
+              <w:top w:w="60" w:type="dxa"/>
+              <w:left w:w="90" w:type="dxa"/>
+              <w:bottom w:w="60" w:type="dxa"/>
+              <w:right w:w="90" w:type="dxa"/>
+            </w:tcMar>
+          </w:tcPr>
+          <w:p>
+            <w:pPr>
+              <w:spacing w:after="0"/>
+            </w:pPr>
+            <w:r>
+              <w:rPr>
+                <w:b/>
+                <w:color w:val="FFFFFF"/>
+                <w:sz w:val="18"/>
+              </w:rPr>
+              <w:t xml:space="preserve">DPA (contrato de tratamento)</w:t>
+            </w:r>
+          </w:p>
+        </w:tc>
+        <w:tc>
+          <w:tcPr>
+            <w:tcW w:w="3780" w:type="dxa"/>
+            <w:shd w:val="clear" w:fill="16233F"/>
+            <w:tcMar>
+              <w:top w:w="60" w:type="dxa"/>
+              <w:left w:w="90" w:type="dxa"/>
+              <w:bottom w:w="60" w:type="dxa"/>
+              <w:right w:w="90" w:type="dxa"/>
+            </w:tcMar>
+          </w:tcPr>
+          <w:p>
+            <w:pPr>
+              <w:spacing w:after="0"/>
+            </w:pPr>
+            <w:r>
+              <w:rPr>
+                <w:b/>
+                <w:color w:val="FFFFFF"/>
+                <w:sz w:val="18"/>
+              </w:rPr>
+              <w:t xml:space="preserve">Trust / Segurança / Certificações</w:t>
+            </w:r>
+          </w:p>
+        </w:tc>
+      </w:tr>
+      <w:tr>
+        <w:tc>
+          <w:tcPr>
+            <w:tcW w:w="1800" w:type="dxa"/>
+            <w:tcMar>
+              <w:top w:w="60" w:type="dxa"/>
+              <w:left w:w="90" w:type="dxa"/>
+              <w:bottom w:w="60" w:type="dxa"/>
+              <w:right w:w="90" w:type="dxa"/>
+            </w:tcMar>
+          </w:tcPr>
+          <w:p>
+            <w:pPr>
+              <w:spacing w:after="0"/>
+            </w:pPr>
+            <w:r>
+              <w:rPr>
+                <w:color w:val="000000"/>
+                <w:sz w:val="18"/>
+              </w:rPr>
+              <w:t xml:space="preserve">Supabase (banco de dados)</w:t>
+            </w:r>
+          </w:p>
+        </w:tc>
+        <w:tc>
+          <w:tcPr>
+            <w:tcW w:w="3780" w:type="dxa"/>
+            <w:tcMar>
+              <w:top w:w="60" w:type="dxa"/>
+              <w:left w:w="90" w:type="dxa"/>
+              <w:bottom w:w="60" w:type="dxa"/>
+              <w:right w:w="90" w:type="dxa"/>
+            </w:tcMar>
+          </w:tcPr>
+          <w:p>
+            <w:pPr>
+              <w:spacing w:after="0"/>
+            </w:pPr>
+            <w:r>
+              <w:rPr>
+                <w:color w:val="000000"/>
+                <w:sz w:val="18"/>
+              </w:rPr>
+              <w:t xml:space="preserve">supabase.com/legal/dpa</w:t>
+            </w:r>
+          </w:p>
+        </w:tc>
+        <w:tc>
+          <w:tcPr>
+            <w:tcW w:w="3780" w:type="dxa"/>
+            <w:tcMar>
+              <w:top w:w="60" w:type="dxa"/>
+              <w:left w:w="90" w:type="dxa"/>
+              <w:bottom w:w="60" w:type="dxa"/>
+              <w:right w:w="90" w:type="dxa"/>
+            </w:tcMar>
+          </w:tcPr>
+          <w:p>
+            <w:pPr>
+              <w:spacing w:after="0"/>
+            </w:pPr>
+            <w:r>
+              <w:rPr>
+                <w:color w:val="000000"/>
+                <w:sz w:val="18"/>
+              </w:rPr>
+              <w:t xml:space="preserve">supabase.com/security · Trust Center: security.supabase.com — SOC 2 Type II (relatório disponível sob NDA).</w:t>
+            </w:r>
+          </w:p>
+        </w:tc>
+      </w:tr>
+      <w:tr>
+        <w:tc>
+          <w:tcPr>
+            <w:tcW w:w="1800" w:type="dxa"/>
+            <w:tcMar>
+              <w:top w:w="60" w:type="dxa"/>
+              <w:left w:w="90" w:type="dxa"/>
+              <w:bottom w:w="60" w:type="dxa"/>
+              <w:right w:w="90" w:type="dxa"/>
+            </w:tcMar>
+          </w:tcPr>
+          <w:p>
+            <w:pPr>
+              <w:spacing w:after="0"/>
+            </w:pPr>
+            <w:r>
+              <w:rPr>
+                <w:color w:val="000000"/>
+                <w:sz w:val="18"/>
+              </w:rPr>
+              <w:t xml:space="preserve">Vercel (hospedagem)</w:t>
+            </w:r>
+          </w:p>
+        </w:tc>
+        <w:tc>
+          <w:tcPr>
+            <w:tcW w:w="3780" w:type="dxa"/>
+            <w:tcMar>
+              <w:top w:w="60" w:type="dxa"/>
+              <w:left w:w="90" w:type="dxa"/>
+              <w:bottom w:w="60" w:type="dxa"/>
+              <w:right w:w="90" w:type="dxa"/>
+            </w:tcMar>
+          </w:tcPr>
+          <w:p>
+            <w:pPr>
+              <w:spacing w:after="0"/>
+            </w:pPr>
+            <w:r>
+              <w:rPr>
+                <w:color w:val="000000"/>
+                <w:sz w:val="18"/>
+              </w:rPr>
+              <w:t xml:space="preserve">vercel.com/legal/dpa</w:t>
+            </w:r>
+          </w:p>
+        </w:tc>
+        <w:tc>
+          <w:tcPr>
+            <w:tcW w:w="3780" w:type="dxa"/>
+            <w:tcMar>
+              <w:top w:w="60" w:type="dxa"/>
+              <w:left w:w="90" w:type="dxa"/>
+              <w:bottom w:w="60" w:type="dxa"/>
+              <w:right w:w="90" w:type="dxa"/>
+            </w:tcMar>
+          </w:tcPr>
+          <w:p>
+            <w:pPr>
+              <w:spacing w:after="0"/>
+            </w:pPr>
+            <w:r>
+              <w:rPr>
+                <w:color w:val="000000"/>
+                <w:sz w:val="18"/>
+              </w:rPr>
+              <w:t xml:space="preserve">vercel.com/security · security.vercel.com — SOC 2 Type II, ISO 27001.</w:t>
+            </w:r>
+          </w:p>
+        </w:tc>
+      </w:tr>
+      <w:tr>
+        <w:tc>
+          <w:tcPr>
+            <w:tcW w:w="1800" w:type="dxa"/>
+            <w:tcMar>
+              <w:top w:w="60" w:type="dxa"/>
+              <w:left w:w="90" w:type="dxa"/>
+              <w:bottom w:w="60" w:type="dxa"/>
+              <w:right w:w="90" w:type="dxa"/>
+            </w:tcMar>
+          </w:tcPr>
+          <w:p>
+            <w:pPr>
+              <w:spacing w:after="0"/>
+            </w:pPr>
+            <w:r>
+              <w:rPr>
+                <w:color w:val="000000"/>
+                <w:sz w:val="18"/>
+              </w:rPr>
+              <w:t xml:space="preserve">Anthropic (I.A. do robô)</w:t>
+            </w:r>
+          </w:p>
+        </w:tc>
+        <w:tc>
+          <w:tcPr>
+            <w:tcW w:w="3780" w:type="dxa"/>
+            <w:tcMar>
+              <w:top w:w="60" w:type="dxa"/>
+              <w:left w:w="90" w:type="dxa"/>
+              <w:bottom w:w="60" w:type="dxa"/>
+              <w:right w:w="90" w:type="dxa"/>
+            </w:tcMar>
+          </w:tcPr>
+          <w:p>
+            <w:pPr>
+              <w:spacing w:after="0"/>
+            </w:pPr>
+            <w:r>
+              <w:rPr>
+                <w:color w:val="000000"/>
+                <w:sz w:val="18"/>
+              </w:rPr>
+              <w:t xml:space="preserve">anthropic.com/legal/commercial-terms (inclui termos de dados)</w:t>
+            </w:r>
+          </w:p>
+        </w:tc>
+        <w:tc>
+          <w:tcPr>
+            <w:tcW w:w="3780" w:type="dxa"/>
+            <w:tcMar>
+              <w:top w:w="60" w:type="dxa"/>
+              <w:left w:w="90" w:type="dxa"/>
+              <w:bottom w:w="60" w:type="dxa"/>
+              <w:right w:w="90" w:type="dxa"/>
+            </w:tcMar>
+          </w:tcPr>
+          <w:p>
+            <w:pPr>
+              <w:spacing w:after="0"/>
+            </w:pPr>
+            <w:r>
+              <w:rPr>
+                <w:color w:val="000000"/>
+                <w:sz w:val="18"/>
+              </w:rPr>
+              <w:t xml:space="preserve">trust.anthropic.com — não treina modelos com dados enviados via API; SOC 2 no Trust Portal.</w:t>
+            </w:r>
+          </w:p>
+        </w:tc>
+      </w:tr>
+      <w:tr>
+        <w:tc>
+          <w:tcPr>
+            <w:tcW w:w="1800" w:type="dxa"/>
+            <w:tcMar>
+              <w:top w:w="60" w:type="dxa"/>
+              <w:left w:w="90" w:type="dxa"/>
+              <w:bottom w:w="60" w:type="dxa"/>
+              <w:right w:w="90" w:type="dxa"/>
+            </w:tcMar>
+          </w:tcPr>
+          <w:p>
+            <w:pPr>
+              <w:spacing w:after="0"/>
+            </w:pPr>
+            <w:r>
+              <w:rPr>
+                <w:color w:val="000000"/>
+                <w:sz w:val="18"/>
+              </w:rPr>
+              <w:t xml:space="preserve">Groq (transcrição de áudio)</w:t>
+            </w:r>
+          </w:p>
+        </w:tc>
+        <w:tc>
+          <w:tcPr>
+            <w:tcW w:w="3780" w:type="dxa"/>
+            <w:tcMar>
+              <w:top w:w="60" w:type="dxa"/>
+              <w:left w:w="90" w:type="dxa"/>
+              <w:bottom w:w="60" w:type="dxa"/>
+              <w:right w:w="90" w:type="dxa"/>
+            </w:tcMar>
+          </w:tcPr>
+          <w:p>
+            <w:pPr>
+              <w:spacing w:after="0"/>
+            </w:pPr>
+            <w:r>
+              <w:rPr>
+                <w:color w:val="000000"/>
+                <w:sz w:val="18"/>
+              </w:rPr>
+              <w:t xml:space="preserve">Solicitar DPA comercial em groq.com</w:t>
+            </w:r>
+          </w:p>
+        </w:tc>
+        <w:tc>
+          <w:tcPr>
+            <w:tcW w:w="3780" w:type="dxa"/>
+            <w:tcMar>
+              <w:top w:w="60" w:type="dxa"/>
+              <w:left w:w="90" w:type="dxa"/>
+              <w:bottom w:w="60" w:type="dxa"/>
+              <w:right w:w="90" w:type="dxa"/>
+            </w:tcMar>
+          </w:tcPr>
+          <w:p>
+            <w:pPr>
+              <w:spacing w:after="0"/>
+            </w:pPr>
+            <w:r>
+              <w:rPr>
+                <w:color w:val="000000"/>
+                <w:sz w:val="18"/>
+              </w:rPr>
+              <w:t xml:space="preserve">trust.groq.com · groq.com/privacy-policy.</w:t>
+            </w:r>
+          </w:p>
+        </w:tc>
+      </w:tr>
+      <w:tr>
+        <w:tc>
+          <w:tcPr>
+            <w:tcW w:w="1800" w:type="dxa"/>
+            <w:tcMar>
+              <w:top w:w="60" w:type="dxa"/>
+              <w:left w:w="90" w:type="dxa"/>
+              <w:bottom w:w="60" w:type="dxa"/>
+              <w:right w:w="90" w:type="dxa"/>
+            </w:tcMar>
+          </w:tcPr>
+          <w:p>
+            <w:pPr>
+              <w:spacing w:after="0"/>
+            </w:pPr>
+            <w:r>
+              <w:rPr>
+                <w:color w:val="000000"/>
+                <w:sz w:val="18"/>
+              </w:rPr>
+              <w:t xml:space="preserve">Z-API (gateway WhatsApp)</w:t>
+            </w:r>
+          </w:p>
+        </w:tc>
+        <w:tc>
+          <w:tcPr>
+            <w:tcW w:w="3780" w:type="dxa"/>
+            <w:tcMar>
+              <w:top w:w="60" w:type="dxa"/>
+              <w:left w:w="90" w:type="dxa"/>
+              <w:bottom w:w="60" w:type="dxa"/>
+              <w:right w:w="90" w:type="dxa"/>
+            </w:tcMar>
+          </w:tcPr>
+          <w:p>
+            <w:pPr>
+              <w:spacing w:after="0"/>
+            </w:pPr>
+            <w:r>
+              <w:rPr>
+                <w:color w:val="000000"/>
+                <w:sz w:val="18"/>
+              </w:rPr>
+              <w:t xml:space="preserve">Solicitar DPA / adendo LGPD ao suporte</w:t>
+            </w:r>
+          </w:p>
+        </w:tc>
+        <w:tc>
+          <w:tcPr>
+            <w:tcW w:w="3780" w:type="dxa"/>
+            <w:tcMar>
+              <w:top w:w="60" w:type="dxa"/>
+              <w:left w:w="90" w:type="dxa"/>
+              <w:bottom w:w="60" w:type="dxa"/>
+              <w:right w:w="90" w:type="dxa"/>
+            </w:tcMar>
+          </w:tcPr>
+          <w:p>
+            <w:pPr>
+              <w:spacing w:after="0"/>
+            </w:pPr>
+            <w:r>
+              <w:rPr>
+                <w:color w:val="000000"/>
+                <w:sz w:val="18"/>
+              </w:rPr>
+              <w:t xml:space="preserve">z-api.io — Política de Privacidade e Termos de Uso (empresa brasileira, sujeita à LGPD).</w:t>
+            </w:r>
+          </w:p>
+        </w:tc>
+      </w:tr>
+    </w:tbl>
+    <w:p>
+      <w:pPr/>
+      <w:r>
+        <w:t/>
+      </w:r>
+    </w:p>
+    <w:p>
+      <w:pPr/>
+      <w:r>
+        <w:rPr>
+          <w:b/>
+        </w:rPr>
+        <w:t xml:space="preserve">Como proceder:</w:t>
+      </w:r>
+      <w:r>
+        <w:t xml:space="preserve"> (1) acessar cada página acima; (2) baixar/assinar o DPA quando disponível on-line, ou solicitar por formulário/suporte quando exigir contato; (3) para os relatórios SOC 2 / ISO (Supabase, Vercel, Anthropic), o acesso costuma ser via Trust Center mediante NDA — solicitar o relatório mais recente; (4) arquivar todos junto a este documento no dossiê de compliance.</w:t>
+      </w:r>
+    </w:p>
+    <w:p>
+      <w:pPr>
+        <w:spacing w:after="120"/>
+      </w:pPr>
+      <w:r>
+        <w:rPr>
+          <w:color w:val="667085"/>
+          <w:sz w:val="18"/>
+        </w:rPr>
+        <w:t xml:space="preserve">Observação: os relatórios da Ambev importados no sistema não trafegam por Anthropic nem Groq (ver Seção 7). Esses dois provedores são relevantes apenas para o robô de WhatsApp de reposição.</w:t>
       </w:r>
     </w:p>
     <w:sectPr>

</xml_diff>